<commit_message>
vault backup: 2026-10-23 13:58:24
</commit_message>
<xml_diff>
--- a/Устав/_документы/By-laws CACF — new version.docx
+++ b/Устав/_документы/By-laws CACF — new version.docx
@@ -5590,7 +5590,25 @@
           <w:szCs w:val="28"/>
           <w:lang w:val="en-US"/>
         </w:rPr>
-        <w:t>on the position of Deputy CEO for Strategy and Projects;</w:t>
+        <w:t xml:space="preserve">on the position of </w:t>
+      </w:r>
+      <w:r>
+        <w:rPr>
+          <w:rFonts w:ascii="Arial" w:hAnsi="Arial" w:cs="Arial"/>
+          <w:sz w:val="28"/>
+          <w:szCs w:val="28"/>
+          <w:lang w:val="en-US"/>
+        </w:rPr>
+        <w:t>Deputy CEO</w:t>
+      </w:r>
+      <w:r>
+        <w:rPr>
+          <w:rFonts w:ascii="Arial" w:hAnsi="Arial" w:cs="Arial"/>
+          <w:sz w:val="28"/>
+          <w:szCs w:val="28"/>
+          <w:lang w:val="en-US"/>
+        </w:rPr>
+        <w:t>;</w:t>
       </w:r>
     </w:p>
     <w:p>
@@ -5777,7 +5795,25 @@
           <w:szCs w:val="28"/>
           <w:lang w:val="en-US"/>
         </w:rPr>
-        <w:t>on the position of Deputy CEO for Strategy and Projects, for the period</w:t>
+        <w:t xml:space="preserve">on the position of </w:t>
+      </w:r>
+      <w:r>
+        <w:rPr>
+          <w:rFonts w:ascii="Arial" w:hAnsi="Arial" w:cs="Arial"/>
+          <w:sz w:val="28"/>
+          <w:szCs w:val="28"/>
+          <w:lang w:val="en-US"/>
+        </w:rPr>
+        <w:t>Deputy CEO</w:t>
+      </w:r>
+      <w:r>
+        <w:rPr>
+          <w:rFonts w:ascii="Arial" w:hAnsi="Arial" w:cs="Arial"/>
+          <w:sz w:val="28"/>
+          <w:szCs w:val="28"/>
+          <w:lang w:val="en-US"/>
+        </w:rPr>
+        <w:t>, for the period</w:t>
       </w:r>
       <w:r>
         <w:rPr>
@@ -7888,7 +7924,25 @@
           <w:szCs w:val="28"/>
           <w:lang w:val="en-GB"/>
         </w:rPr>
-        <w:t>by the Deputy CEO for Strategy and Projects (section 6.1.(b))</w:t>
+        <w:t xml:space="preserve">by the </w:t>
+      </w:r>
+      <w:r>
+        <w:rPr>
+          <w:rFonts w:ascii="Arial" w:hAnsi="Arial" w:cs="Arial"/>
+          <w:sz w:val="28"/>
+          <w:szCs w:val="28"/>
+          <w:lang w:val="en-GB"/>
+        </w:rPr>
+        <w:t>Deputy CEO</w:t>
+      </w:r>
+      <w:r>
+        <w:rPr>
+          <w:rFonts w:ascii="Arial" w:hAnsi="Arial" w:cs="Arial"/>
+          <w:sz w:val="28"/>
+          <w:szCs w:val="28"/>
+          <w:lang w:val="en-GB"/>
+        </w:rPr>
+        <w:t xml:space="preserve"> (section 6.1.(b))</w:t>
       </w:r>
       <w:r>
         <w:rPr>

</xml_diff>